<commit_message>
Re-render manuscript and CHEERS checklist Word files with corrected CPI results
Co-Authored-By: Claude Opus 5 <noreply@anthropic.com>
Claude-Session: https://claude.ai/code/session_01DaPqEsptQdWDLk4uNL5ydn
</commit_message>
<xml_diff>
--- a/manuscript/cheers_checklist.docx
+++ b/manuscript/cheers_checklist.docx
@@ -1637,7 +1637,7 @@
               <w:t xml:space="preserve"> </w:t>
             </w:r>
             <w:r>
-              <w:t xml:space="preserve">“In the base case, combined biopsy cost an estimated $486 per patient, compared with $727 for standalone office biopsy and $3,823 for operative D&amp;C. Combined biopsy was $241 (33.1%) less expensive than office biopsy…”</w:t>
+              <w:t xml:space="preserve">“In the base case, combined biopsy cost an estimated $485 per patient, compared with $727 for standalone office biopsy and $3,823 for operative D&amp;C. Combined biopsy was $242 (33.3%) less expensive than office biopsy…”</w:t>
             </w:r>
             <w:r>
               <w:t xml:space="preserve"> </w:t>
@@ -1709,7 +1709,7 @@
               <w:t xml:space="preserve"> </w:t>
             </w:r>
             <w:r>
-              <w:t xml:space="preserve">“Across 1,000 probabilistic-sensitivity draws, combined biopsy had a mean cost of $520 (SD $115) and office biopsy a mean cost of $733 (SD $119). Combined biopsy was the least expensive strategy in 91.6% of draws; D&amp;C was never the least expensive strategy in any draw.”</w:t>
+              <w:t xml:space="preserve">“Across 1,000 probabilistic-sensitivity draws, combined biopsy had a mean cost of $519 (SD $115) and office biopsy a mean cost of $733 (SD $119). Combined biopsy was the least expensive strategy in 91.8% of draws; D&amp;C was never the least expensive strategy in any draw.”</w:t>
             </w:r>
             <w:r>
               <w:t xml:space="preserve"> </w:t>

</xml_diff>